<commit_message>
docs: add Part 6 to brutal assessment — cash flow goal reframe
Reframes the alpha-focused critique against the actual goal: consistent daily
cash flow, not beating hedge funds. Keeps all alpha/product content (Parts 1-5)
intact. Part 6 covers: the EV math showing $720/day at 55% win rate with 3:1 R:R,
which brutal assessment points still apply vs. which don't, why Mode 1 intraday
fits cash flow better than Mode 2, the three real risks (paper-to-live degradation,
regime sensitivity, capital adequacy), and explicitly decouples App 1 (cash flow)
from App 2 (future SaaS product).

Co-Authored-By: Claude Sonnet 4.6 <noreply@anthropic.com>
</commit_message>
<xml_diff>
--- a/Trading_Agent_Brutal_Assessment.docx
+++ b/Trading_Agent_Brutal_Assessment.docx
@@ -2383,7 +2383,7 @@
           <w:color w:val="F47B20"/>
           <w:sz w:val="22"/>
         </w:rPr>
-        <w:t>Recommended Sprint Order (Post-June 1)</w:t>
+        <w:t>Recommended Sprint Order — Alpha / Product Path (Post-June 1)</w:t>
       </w:r>
     </w:p>
     <w:p>
@@ -2457,6 +2457,1447 @@
       </w:pPr>
       <w:r>
         <w:t>The path to a real edge runs through events and alternative data — not through better technical indicator combinations or more sophisticated LLM prompting. Every sprint that improves the signal layer matters more than every sprint that improves the operational layer.</w:t>
+      </w:r>
+    </w:p>
+    <w:p>
+      <w:r>
+        <w:br w:type="page"/>
+      </w:r>
+    </w:p>
+    <w:p>
+      <w:pPr>
+        <w:pStyle w:val="Heading1"/>
+      </w:pPr>
+      <w:r>
+        <w:rPr>
+          <w:color w:val="1A3A6A"/>
+        </w:rPr>
+        <w:t>Part 6: Reframe — Cash Flow Goal vs. Alpha Goal</w:t>
+      </w:r>
+    </w:p>
+    <w:p>
+      <w:pPr>
+        <w:spacing w:after="80"/>
+      </w:pPr>
+      <w:r>
+        <w:t>Parts 1–5 were written against the wrong benchmark. The goal of this system is not to beat the market, outperform hedge funds, or achieve a publishable Sharpe ratio. The goal is to generate a reliable daily income — a predefined cash flow target — without a day job. That is a fundamentally different problem, and most of the brutal critique above does not apply to it.</w:t>
+      </w:r>
+    </w:p>
+    <w:p>
+      <w:pPr>
+        <w:spacing w:before="80" w:after="80"/>
+      </w:pPr>
+      <w:r>
+        <w:rPr>
+          <w:color w:val="CCCCCC"/>
+          <w:sz w:val="16"/>
+        </w:rPr>
+        <w:t>────────────────────────────────────────────────────────────────────────────────</w:t>
+      </w:r>
+    </w:p>
+    <w:p>
+      <w:pPr>
+        <w:spacing w:before="160" w:after="40"/>
+      </w:pPr>
+      <w:r>
+        <w:rPr>
+          <w:b/>
+          <w:color w:val="F47B20"/>
+          <w:sz w:val="22"/>
+        </w:rPr>
+        <w:t>The Math Reframe</w:t>
+      </w:r>
+    </w:p>
+    <w:p>
+      <w:pPr>
+        <w:spacing w:after="80"/>
+      </w:pPr>
+      <w:r>
+        <w:t>With 3:1 reward:risk, you only need to be right more than 25% of the time to be profitable. At a 55% win rate (what the backtest suggests):</w:t>
+      </w:r>
+    </w:p>
+    <w:tbl>
+      <w:tblPr>
+        <w:tblStyle w:val="TableGrid"/>
+        <w:tblW w:type="auto" w:w="0"/>
+        <w:tblLook w:firstColumn="1" w:firstRow="1" w:lastColumn="0" w:lastRow="0" w:noHBand="0" w:noVBand="1" w:val="04A0"/>
+      </w:tblPr>
+      <w:tblGrid>
+        <w:gridCol w:w="4320"/>
+        <w:gridCol w:w="4320"/>
+      </w:tblGrid>
+      <w:tr>
+        <w:tc>
+          <w:tcPr>
+            <w:tcW w:type="dxa" w:w="4320"/>
+          </w:tcPr>
+          <w:p>
+            <w:r>
+              <w:rPr>
+                <w:b/>
+                <w:color w:val="1A3A6A"/>
+              </w:rPr>
+              <w:t>Input</w:t>
+            </w:r>
+          </w:p>
+        </w:tc>
+        <w:tc>
+          <w:tcPr>
+            <w:tcW w:type="dxa" w:w="4320"/>
+          </w:tcPr>
+          <w:p>
+            <w:r>
+              <w:rPr>
+                <w:b/>
+                <w:color w:val="1A3A6A"/>
+              </w:rPr>
+              <w:t>Value</w:t>
+            </w:r>
+          </w:p>
+        </w:tc>
+      </w:tr>
+      <w:tr>
+        <w:tc>
+          <w:tcPr>
+            <w:tcW w:type="dxa" w:w="4320"/>
+          </w:tcPr>
+          <w:p/>
+        </w:tc>
+        <w:tc>
+          <w:tcPr>
+            <w:tcW w:type="dxa" w:w="4320"/>
+          </w:tcPr>
+          <w:p/>
+        </w:tc>
+      </w:tr>
+      <w:tr>
+        <w:tc>
+          <w:tcPr>
+            <w:tcW w:type="dxa" w:w="4320"/>
+          </w:tcPr>
+          <w:p/>
+        </w:tc>
+        <w:tc>
+          <w:tcPr>
+            <w:tcW w:type="dxa" w:w="4320"/>
+          </w:tcPr>
+          <w:p/>
+        </w:tc>
+      </w:tr>
+      <w:tr>
+        <w:tc>
+          <w:tcPr>
+            <w:tcW w:type="dxa" w:w="4320"/>
+          </w:tcPr>
+          <w:p/>
+        </w:tc>
+        <w:tc>
+          <w:tcPr>
+            <w:tcW w:type="dxa" w:w="4320"/>
+          </w:tcPr>
+          <w:p/>
+        </w:tc>
+      </w:tr>
+      <w:tr>
+        <w:tc>
+          <w:tcPr>
+            <w:tcW w:type="dxa" w:w="4320"/>
+          </w:tcPr>
+          <w:p/>
+        </w:tc>
+        <w:tc>
+          <w:tcPr>
+            <w:tcW w:type="dxa" w:w="4320"/>
+          </w:tcPr>
+          <w:p/>
+        </w:tc>
+      </w:tr>
+      <w:tr>
+        <w:tc>
+          <w:tcPr>
+            <w:tcW w:type="dxa" w:w="4320"/>
+          </w:tcPr>
+          <w:p/>
+        </w:tc>
+        <w:tc>
+          <w:tcPr>
+            <w:tcW w:type="dxa" w:w="4320"/>
+          </w:tcPr>
+          <w:p/>
+        </w:tc>
+      </w:tr>
+      <w:tr>
+        <w:tc>
+          <w:tcPr>
+            <w:tcW w:type="dxa" w:w="4320"/>
+          </w:tcPr>
+          <w:p/>
+        </w:tc>
+        <w:tc>
+          <w:tcPr>
+            <w:tcW w:type="dxa" w:w="4320"/>
+          </w:tcPr>
+          <w:p/>
+        </w:tc>
+      </w:tr>
+      <w:tr>
+        <w:tc>
+          <w:tcPr>
+            <w:tcW w:type="dxa" w:w="4320"/>
+          </w:tcPr>
+          <w:p>
+            <w:r>
+              <w:t>Win rate</w:t>
+            </w:r>
+          </w:p>
+        </w:tc>
+        <w:tc>
+          <w:tcPr>
+            <w:tcW w:type="dxa" w:w="4320"/>
+          </w:tcPr>
+          <w:p>
+            <w:r>
+              <w:t>55%</w:t>
+            </w:r>
+          </w:p>
+        </w:tc>
+      </w:tr>
+      <w:tr>
+        <w:tc>
+          <w:tcPr>
+            <w:tcW w:type="dxa" w:w="4320"/>
+          </w:tcPr>
+          <w:p>
+            <w:r>
+              <w:t>Avg gain per trade (2% on $6K)</w:t>
+            </w:r>
+          </w:p>
+        </w:tc>
+        <w:tc>
+          <w:tcPr>
+            <w:tcW w:type="dxa" w:w="4320"/>
+          </w:tcPr>
+          <w:p>
+            <w:r>
+              <w:t>$120</w:t>
+            </w:r>
+          </w:p>
+        </w:tc>
+      </w:tr>
+      <w:tr>
+        <w:tc>
+          <w:tcPr>
+            <w:tcW w:type="dxa" w:w="4320"/>
+          </w:tcPr>
+          <w:p>
+            <w:r>
+              <w:t>Avg loss per trade (0.67% on $6K)</w:t>
+            </w:r>
+          </w:p>
+        </w:tc>
+        <w:tc>
+          <w:tcPr>
+            <w:tcW w:type="dxa" w:w="4320"/>
+          </w:tcPr>
+          <w:p>
+            <w:r>
+              <w:t>$40</w:t>
+            </w:r>
+          </w:p>
+        </w:tc>
+      </w:tr>
+      <w:tr>
+        <w:tc>
+          <w:tcPr>
+            <w:tcW w:type="dxa" w:w="4320"/>
+          </w:tcPr>
+          <w:p>
+            <w:r>
+              <w:t>Expected value per trade</w:t>
+            </w:r>
+          </w:p>
+        </w:tc>
+        <w:tc>
+          <w:tcPr>
+            <w:tcW w:type="dxa" w:w="4320"/>
+          </w:tcPr>
+          <w:p>
+            <w:r>
+              <w:t>0.55 × $120 − 0.45 × $40 = $48</w:t>
+            </w:r>
+          </w:p>
+        </w:tc>
+      </w:tr>
+      <w:tr>
+        <w:tc>
+          <w:tcPr>
+            <w:tcW w:type="dxa" w:w="4320"/>
+          </w:tcPr>
+          <w:p>
+            <w:r>
+              <w:t>15 trades per day</w:t>
+            </w:r>
+          </w:p>
+        </w:tc>
+        <w:tc>
+          <w:tcPr>
+            <w:tcW w:type="dxa" w:w="4320"/>
+          </w:tcPr>
+          <w:p>
+            <w:r>
+              <w:t>$48 × 15 = $720/day expected value</w:t>
+            </w:r>
+          </w:p>
+        </w:tc>
+      </w:tr>
+      <w:tr>
+        <w:tc>
+          <w:tcPr>
+            <w:tcW w:type="dxa" w:w="4320"/>
+          </w:tcPr>
+          <w:p>
+            <w:r>
+              <w:t>Even at 40% degradation (live slippage)</w:t>
+            </w:r>
+          </w:p>
+        </w:tc>
+        <w:tc>
+          <w:tcPr>
+            <w:tcW w:type="dxa" w:w="4320"/>
+          </w:tcPr>
+          <w:p>
+            <w:r>
+              <w:t>$720 × 0.60 = $432/day</w:t>
+            </w:r>
+          </w:p>
+        </w:tc>
+      </w:tr>
+    </w:tbl>
+    <w:p/>
+    <w:p>
+      <w:pPr>
+        <w:spacing w:after="80"/>
+      </w:pPr>
+      <w:r>
+        <w:t>The comparison to Renaissance Medallion (39% net annualized) was irrelevant. That benchmark applies when the goal is maximum compounding on unlimited capital. When the goal is $500–700/day cash flow on $100K, a 55% win rate with 3:1 R:R is a sound, achievable system — not an implausible one.</w:t>
+      </w:r>
+    </w:p>
+    <w:p>
+      <w:pPr>
+        <w:spacing w:before="80" w:after="80"/>
+      </w:pPr>
+      <w:r>
+        <w:rPr>
+          <w:color w:val="CCCCCC"/>
+          <w:sz w:val="16"/>
+        </w:rPr>
+        <w:t>────────────────────────────────────────────────────────────────────────────────</w:t>
+      </w:r>
+    </w:p>
+    <w:p>
+      <w:pPr>
+        <w:spacing w:before="160" w:after="40"/>
+      </w:pPr>
+      <w:r>
+        <w:rPr>
+          <w:b/>
+          <w:color w:val="F47B20"/>
+          <w:sz w:val="22"/>
+        </w:rPr>
+        <w:t>Which Brutal Assessment Points Still Apply</w:t>
+      </w:r>
+    </w:p>
+    <w:tbl>
+      <w:tblPr>
+        <w:tblStyle w:val="TableGrid"/>
+        <w:tblW w:type="auto" w:w="0"/>
+        <w:tblLook w:firstColumn="1" w:firstRow="1" w:lastColumn="0" w:lastRow="0" w:noHBand="0" w:noVBand="1" w:val="04A0"/>
+      </w:tblPr>
+      <w:tblGrid>
+        <w:gridCol w:w="2880"/>
+        <w:gridCol w:w="2880"/>
+        <w:gridCol w:w="2880"/>
+      </w:tblGrid>
+      <w:tr>
+        <w:tc>
+          <w:tcPr>
+            <w:tcW w:type="dxa" w:w="2880"/>
+          </w:tcPr>
+          <w:p>
+            <w:r>
+              <w:rPr>
+                <w:b/>
+                <w:color w:val="1A3A6A"/>
+              </w:rPr>
+              <w:t>Assessment Point</w:t>
+            </w:r>
+          </w:p>
+        </w:tc>
+        <w:tc>
+          <w:tcPr>
+            <w:tcW w:type="dxa" w:w="2880"/>
+          </w:tcPr>
+          <w:p>
+            <w:r>
+              <w:rPr>
+                <w:b/>
+                <w:color w:val="1A3A6A"/>
+              </w:rPr>
+              <w:t>Still Relevant for Cash Flow?</w:t>
+            </w:r>
+          </w:p>
+        </w:tc>
+        <w:tc>
+          <w:tcPr>
+            <w:tcW w:type="dxa" w:w="2880"/>
+          </w:tcPr>
+          <w:p>
+            <w:r>
+              <w:rPr>
+                <w:b/>
+                <w:color w:val="1A3A6A"/>
+              </w:rPr>
+              <w:t>Why</w:t>
+            </w:r>
+          </w:p>
+        </w:tc>
+      </w:tr>
+      <w:tr>
+        <w:tc>
+          <w:tcPr>
+            <w:tcW w:type="dxa" w:w="2880"/>
+          </w:tcPr>
+          <w:p/>
+        </w:tc>
+        <w:tc>
+          <w:tcPr>
+            <w:tcW w:type="dxa" w:w="2880"/>
+          </w:tcPr>
+          <w:p/>
+        </w:tc>
+        <w:tc>
+          <w:tcPr>
+            <w:tcW w:type="dxa" w:w="2880"/>
+          </w:tcPr>
+          <w:p/>
+        </w:tc>
+      </w:tr>
+      <w:tr>
+        <w:tc>
+          <w:tcPr>
+            <w:tcW w:type="dxa" w:w="2880"/>
+          </w:tcPr>
+          <w:p/>
+        </w:tc>
+        <w:tc>
+          <w:tcPr>
+            <w:tcW w:type="dxa" w:w="2880"/>
+          </w:tcPr>
+          <w:p/>
+        </w:tc>
+        <w:tc>
+          <w:tcPr>
+            <w:tcW w:type="dxa" w:w="2880"/>
+          </w:tcPr>
+          <w:p/>
+        </w:tc>
+      </w:tr>
+      <w:tr>
+        <w:tc>
+          <w:tcPr>
+            <w:tcW w:type="dxa" w:w="2880"/>
+          </w:tcPr>
+          <w:p/>
+        </w:tc>
+        <w:tc>
+          <w:tcPr>
+            <w:tcW w:type="dxa" w:w="2880"/>
+          </w:tcPr>
+          <w:p/>
+        </w:tc>
+        <w:tc>
+          <w:tcPr>
+            <w:tcW w:type="dxa" w:w="2880"/>
+          </w:tcPr>
+          <w:p/>
+        </w:tc>
+      </w:tr>
+      <w:tr>
+        <w:tc>
+          <w:tcPr>
+            <w:tcW w:type="dxa" w:w="2880"/>
+          </w:tcPr>
+          <w:p/>
+        </w:tc>
+        <w:tc>
+          <w:tcPr>
+            <w:tcW w:type="dxa" w:w="2880"/>
+          </w:tcPr>
+          <w:p/>
+        </w:tc>
+        <w:tc>
+          <w:tcPr>
+            <w:tcW w:type="dxa" w:w="2880"/>
+          </w:tcPr>
+          <w:p/>
+        </w:tc>
+      </w:tr>
+      <w:tr>
+        <w:tc>
+          <w:tcPr>
+            <w:tcW w:type="dxa" w:w="2880"/>
+          </w:tcPr>
+          <w:p/>
+        </w:tc>
+        <w:tc>
+          <w:tcPr>
+            <w:tcW w:type="dxa" w:w="2880"/>
+          </w:tcPr>
+          <w:p/>
+        </w:tc>
+        <w:tc>
+          <w:tcPr>
+            <w:tcW w:type="dxa" w:w="2880"/>
+          </w:tcPr>
+          <w:p/>
+        </w:tc>
+      </w:tr>
+      <w:tr>
+        <w:tc>
+          <w:tcPr>
+            <w:tcW w:type="dxa" w:w="2880"/>
+          </w:tcPr>
+          <w:p/>
+        </w:tc>
+        <w:tc>
+          <w:tcPr>
+            <w:tcW w:type="dxa" w:w="2880"/>
+          </w:tcPr>
+          <w:p/>
+        </w:tc>
+        <w:tc>
+          <w:tcPr>
+            <w:tcW w:type="dxa" w:w="2880"/>
+          </w:tcPr>
+          <w:p/>
+        </w:tc>
+      </w:tr>
+      <w:tr>
+        <w:tc>
+          <w:tcPr>
+            <w:tcW w:type="dxa" w:w="2880"/>
+          </w:tcPr>
+          <w:p/>
+        </w:tc>
+        <w:tc>
+          <w:tcPr>
+            <w:tcW w:type="dxa" w:w="2880"/>
+          </w:tcPr>
+          <w:p/>
+        </w:tc>
+        <w:tc>
+          <w:tcPr>
+            <w:tcW w:type="dxa" w:w="2880"/>
+          </w:tcPr>
+          <w:p/>
+        </w:tc>
+      </w:tr>
+      <w:tr>
+        <w:tc>
+          <w:tcPr>
+            <w:tcW w:type="dxa" w:w="2880"/>
+          </w:tcPr>
+          <w:p/>
+        </w:tc>
+        <w:tc>
+          <w:tcPr>
+            <w:tcW w:type="dxa" w:w="2880"/>
+          </w:tcPr>
+          <w:p/>
+        </w:tc>
+        <w:tc>
+          <w:tcPr>
+            <w:tcW w:type="dxa" w:w="2880"/>
+          </w:tcPr>
+          <w:p/>
+        </w:tc>
+      </w:tr>
+      <w:tr>
+        <w:tc>
+          <w:tcPr>
+            <w:tcW w:type="dxa" w:w="2880"/>
+          </w:tcPr>
+          <w:p>
+            <w:r>
+              <w:t>"175% annualized beats Renaissance" — implausible</w:t>
+            </w:r>
+          </w:p>
+        </w:tc>
+        <w:tc>
+          <w:tcPr>
+            <w:tcW w:type="dxa" w:w="2880"/>
+          </w:tcPr>
+          <w:p>
+            <w:r>
+              <w:t>No</w:t>
+            </w:r>
+          </w:p>
+        </w:tc>
+        <w:tc>
+          <w:tcPr>
+            <w:tcW w:type="dxa" w:w="2880"/>
+          </w:tcPr>
+          <w:p>
+            <w:r>
+              <w:t>Wrong benchmark. Cash flow does not require compounding.</w:t>
+            </w:r>
+          </w:p>
+        </w:tc>
+      </w:tr>
+      <w:tr>
+        <w:tc>
+          <w:tcPr>
+            <w:tcW w:type="dxa" w:w="2880"/>
+          </w:tcPr>
+          <w:p>
+            <w:r>
+              <w:t>"Technical signals have no academic edge"</w:t>
+            </w:r>
+          </w:p>
+        </w:tc>
+        <w:tc>
+          <w:tcPr>
+            <w:tcW w:type="dxa" w:w="2880"/>
+          </w:tcPr>
+          <w:p>
+            <w:r>
+              <w:t>Partially</w:t>
+            </w:r>
+          </w:p>
+        </w:tc>
+        <w:tc>
+          <w:tcPr>
+            <w:tcW w:type="dxa" w:w="2880"/>
+          </w:tcPr>
+          <w:p>
+            <w:r>
+              <w:t>Still matters — if win rate drops below 40%, the EV turns negative. But 55% + 3:1 R:R works.</w:t>
+            </w:r>
+          </w:p>
+        </w:tc>
+      </w:tr>
+      <w:tr>
+        <w:tc>
+          <w:tcPr>
+            <w:tcW w:type="dxa" w:w="2880"/>
+          </w:tcPr>
+          <w:p>
+            <w:r>
+              <w:t>"Claude is wrong signal source"</w:t>
+            </w:r>
+          </w:p>
+        </w:tc>
+        <w:tc>
+          <w:tcPr>
+            <w:tcW w:type="dxa" w:w="2880"/>
+          </w:tcPr>
+          <w:p>
+            <w:r>
+              <w:t>Less critical</w:t>
+            </w:r>
+          </w:p>
+        </w:tc>
+        <w:tc>
+          <w:tcPr>
+            <w:tcW w:type="dxa" w:w="2880"/>
+          </w:tcPr>
+          <w:p>
+            <w:r>
+              <w:t>If positive EV is consistent across market regimes, the source need not be Nobel-worthy.</w:t>
+            </w:r>
+          </w:p>
+        </w:tc>
+      </w:tr>
+      <w:tr>
+        <w:tc>
+          <w:tcPr>
+            <w:tcW w:type="dxa" w:w="2880"/>
+          </w:tcPr>
+          <w:p>
+            <w:r>
+              <w:t>"30-day backtest not statistically significant"</w:t>
+            </w:r>
+          </w:p>
+        </w:tc>
+        <w:tc>
+          <w:tcPr>
+            <w:tcW w:type="dxa" w:w="2880"/>
+          </w:tcPr>
+          <w:p>
+            <w:r>
+              <w:t>Yes</w:t>
+            </w:r>
+          </w:p>
+        </w:tc>
+        <w:tc>
+          <w:tcPr>
+            <w:tcW w:type="dxa" w:w="2880"/>
+          </w:tcPr>
+          <w:p>
+            <w:r>
+              <w:t>Still true. Need to see the system across multiple market regimes.</w:t>
+            </w:r>
+          </w:p>
+        </w:tc>
+      </w:tr>
+      <w:tr>
+        <w:tc>
+          <w:tcPr>
+            <w:tcW w:type="dxa" w:w="2880"/>
+          </w:tcPr>
+          <w:p>
+            <w:r>
+              <w:t>"Paper-to-live degradation"</w:t>
+            </w:r>
+          </w:p>
+        </w:tc>
+        <w:tc>
+          <w:tcPr>
+            <w:tcW w:type="dxa" w:w="2880"/>
+          </w:tcPr>
+          <w:p>
+            <w:r>
+              <w:t>Yes — biggest risk</w:t>
+            </w:r>
+          </w:p>
+        </w:tc>
+        <w:tc>
+          <w:tcPr>
+            <w:tcW w:type="dxa" w:w="2880"/>
+          </w:tcPr>
+          <w:p>
+            <w:r>
+              <w:t>Unknown how much win rate degrades on real fills. This is the key variable.</w:t>
+            </w:r>
+          </w:p>
+        </w:tc>
+      </w:tr>
+      <w:tr>
+        <w:tc>
+          <w:tcPr>
+            <w:tcW w:type="dxa" w:w="2880"/>
+          </w:tcPr>
+          <w:p>
+            <w:r>
+              <w:t>"Lock-in is a behavioral trap"</w:t>
+            </w:r>
+          </w:p>
+        </w:tc>
+        <w:tc>
+          <w:tcPr>
+            <w:tcW w:type="dxa" w:w="2880"/>
+          </w:tcPr>
+          <w:p>
+            <w:r>
+              <w:t>No — reversed</w:t>
+            </w:r>
+          </w:p>
+        </w:tc>
+        <w:tc>
+          <w:tcPr>
+            <w:tcW w:type="dxa" w:w="2880"/>
+          </w:tcPr>
+          <w:p>
+            <w:r>
+              <w:t>For cash flow, locking in at $716 when the day target is hit is exactly right behavior.</w:t>
+            </w:r>
+          </w:p>
+        </w:tc>
+      </w:tr>
+      <w:tr>
+        <w:tc>
+          <w:tcPr>
+            <w:tcW w:type="dxa" w:w="2880"/>
+          </w:tcPr>
+          <w:p>
+            <w:r>
+              <w:t>"Need Mode 2 / PEAD / insider buying"</w:t>
+            </w:r>
+          </w:p>
+        </w:tc>
+        <w:tc>
+          <w:tcPr>
+            <w:tcW w:type="dxa" w:w="2880"/>
+          </w:tcPr>
+          <w:p>
+            <w:r>
+              <w:t>No</w:t>
+            </w:r>
+          </w:p>
+        </w:tc>
+        <w:tc>
+          <w:tcPr>
+            <w:tcW w:type="dxa" w:w="2880"/>
+          </w:tcPr>
+          <w:p>
+            <w:r>
+              <w:t>Mode 2 is for alpha and product. Not needed for cash flow. Mode 1 intraday is the right fit.</w:t>
+            </w:r>
+          </w:p>
+        </w:tc>
+      </w:tr>
+      <w:tr>
+        <w:tc>
+          <w:tcPr>
+            <w:tcW w:type="dxa" w:w="2880"/>
+          </w:tcPr>
+          <w:p>
+            <w:r>
+              <w:t>"Replace dollar target with Sharpe ratio"</w:t>
+            </w:r>
+          </w:p>
+        </w:tc>
+        <w:tc>
+          <w:tcPr>
+            <w:tcW w:type="dxa" w:w="2880"/>
+          </w:tcPr>
+          <w:p>
+            <w:r>
+              <w:t>No</w:t>
+            </w:r>
+          </w:p>
+        </w:tc>
+        <w:tc>
+          <w:tcPr>
+            <w:tcW w:type="dxa" w:w="2880"/>
+          </w:tcPr>
+          <w:p>
+            <w:r>
+              <w:t>Sharpe ratio is for alpha optimization. Dollar target is appropriate for cash flow.</w:t>
+            </w:r>
+          </w:p>
+        </w:tc>
+      </w:tr>
+    </w:tbl>
+    <w:p/>
+    <w:p>
+      <w:pPr>
+        <w:spacing w:before="80" w:after="80"/>
+      </w:pPr>
+      <w:r>
+        <w:rPr>
+          <w:color w:val="CCCCCC"/>
+          <w:sz w:val="16"/>
+        </w:rPr>
+        <w:t>────────────────────────────────────────────────────────────────────────────────</w:t>
+      </w:r>
+    </w:p>
+    <w:p>
+      <w:pPr>
+        <w:spacing w:before="160" w:after="40"/>
+      </w:pPr>
+      <w:r>
+        <w:rPr>
+          <w:b/>
+          <w:color w:val="F47B20"/>
+          <w:sz w:val="22"/>
+        </w:rPr>
+        <w:t>Why Mode 1 (Intraday) Is the Right Fit for Cash Flow</w:t>
+      </w:r>
+    </w:p>
+    <w:p>
+      <w:pPr>
+        <w:pStyle w:val="ListBullet"/>
+        <w:spacing w:after="40"/>
+        <w:ind w:left="360"/>
+      </w:pPr>
+      <w:r>
+        <w:t>P&amp;L is known every day — predictable income, not lumpy quarterly events</w:t>
+      </w:r>
+    </w:p>
+    <w:p>
+      <w:pPr>
+        <w:pStyle w:val="ListBullet"/>
+        <w:spacing w:after="40"/>
+        <w:ind w:left="360"/>
+      </w:pPr>
+      <w:r>
+        <w:t>Capital resets daily — no capital tied up in 20-day PEAD holds</w:t>
+      </w:r>
+    </w:p>
+    <w:p>
+      <w:pPr>
+        <w:pStyle w:val="ListBullet"/>
+        <w:spacing w:after="40"/>
+        <w:ind w:left="360"/>
+      </w:pPr>
+      <w:r>
+        <w:t>Lock-in at $716 is perfectly designed for "hit the number, protect it, done"</w:t>
+      </w:r>
+    </w:p>
+    <w:p>
+      <w:pPr>
+        <w:pStyle w:val="ListBullet"/>
+        <w:spacing w:after="40"/>
+        <w:ind w:left="360"/>
+      </w:pPr>
+      <w:r>
+        <w:t>Daily loss limit (-$300) contains downside on bad days</w:t>
+      </w:r>
+    </w:p>
+    <w:p>
+      <w:pPr>
+        <w:pStyle w:val="ListBullet"/>
+        <w:spacing w:after="40"/>
+        <w:ind w:left="360"/>
+      </w:pPr>
+      <w:r>
+        <w:t>No overnight risk — clean slate every morning</w:t>
+      </w:r>
+    </w:p>
+    <w:p>
+      <w:pPr>
+        <w:spacing w:after="80"/>
+      </w:pPr>
+      <w:r>
+        <w:t>Mode 2 (event-driven, PEAD, multi-day holds) is better for maximizing risk-adjusted returns and for a SaaS product signal. It is worse for predictable daily cash flow. Keep Mode 1 as the primary engine for the cash flow goal.</w:t>
+      </w:r>
+    </w:p>
+    <w:p>
+      <w:pPr>
+        <w:spacing w:before="80" w:after="80"/>
+      </w:pPr>
+      <w:r>
+        <w:rPr>
+          <w:color w:val="CCCCCC"/>
+          <w:sz w:val="16"/>
+        </w:rPr>
+        <w:t>────────────────────────────────────────────────────────────────────────────────</w:t>
+      </w:r>
+    </w:p>
+    <w:p>
+      <w:pPr>
+        <w:spacing w:before="160" w:after="40"/>
+      </w:pPr>
+      <w:r>
+        <w:rPr>
+          <w:b/>
+          <w:color w:val="F47B20"/>
+          <w:sz w:val="22"/>
+        </w:rPr>
+        <w:t>The Three Real Risks That Remain</w:t>
+      </w:r>
+    </w:p>
+    <w:p>
+      <w:pPr>
+        <w:spacing w:after="80"/>
+      </w:pPr>
+      <w:r>
+        <w:t>The brutal assessment shrinks to three questions for the cash flow goal:</w:t>
+      </w:r>
+    </w:p>
+    <w:p>
+      <w:pPr>
+        <w:spacing w:before="160" w:after="40"/>
+      </w:pPr>
+      <w:r>
+        <w:rPr>
+          <w:b/>
+          <w:color w:val="F47B20"/>
+          <w:sz w:val="22"/>
+        </w:rPr>
+        <w:t>Risk 1: Paper-to-Live Degradation</w:t>
+      </w:r>
+    </w:p>
+    <w:p>
+      <w:pPr>
+        <w:spacing w:after="80"/>
+      </w:pPr>
+      <w:r>
+        <w:t>Does the 55% win rate hold on real fills? Limit orders at entry × 1.001 work on paper. Real fills depend on queue position, spread, and order book depth. If win rate drops to 45% live, EV per trade drops from $48 to $14 — still positive, but daily output falls to ~$210. At 40% win rate, EV goes negative.</w:t>
+      </w:r>
+    </w:p>
+    <w:p>
+      <w:pPr>
+        <w:pStyle w:val="ListBullet"/>
+        <w:spacing w:after="40"/>
+        <w:ind w:left="360"/>
+      </w:pPr>
+      <w:r>
+        <w:t>Mitigation: start real money small ($10K–$25K); validate live fill quality before scaling</w:t>
+      </w:r>
+    </w:p>
+    <w:p>
+      <w:pPr>
+        <w:pStyle w:val="ListBullet"/>
+        <w:spacing w:after="40"/>
+        <w:ind w:left="360"/>
+      </w:pPr>
+      <w:r>
+        <w:t>Mitigation: model slippage explicitly in eval — track paper price vs. actual fill price</w:t>
+      </w:r>
+    </w:p>
+    <w:p>
+      <w:pPr>
+        <w:spacing w:before="160" w:after="40"/>
+      </w:pPr>
+      <w:r>
+        <w:rPr>
+          <w:b/>
+          <w:color w:val="F47B20"/>
+          <w:sz w:val="22"/>
+        </w:rPr>
+        <w:t>Risk 2: Regime Sensitivity</w:t>
+      </w:r>
+    </w:p>
+    <w:p>
+      <w:pPr>
+        <w:spacing w:after="80"/>
+      </w:pPr>
+      <w:r>
+        <w:t>The 30-day backtest ran in a momentum-favorable market (post-tariff recovery, April–May 2026). Does the system work in a choppy sideways market? A trending-down market? Unknown — we have not seen it run through multiple regimes.</w:t>
+      </w:r>
+    </w:p>
+    <w:p>
+      <w:pPr>
+        <w:pStyle w:val="ListBullet"/>
+        <w:spacing w:after="40"/>
+        <w:ind w:left="360"/>
+      </w:pPr>
+      <w:r>
+        <w:t>Mitigation: the VIX gate and futures gate already reduce exposure on bad market days</w:t>
+      </w:r>
+    </w:p>
+    <w:p>
+      <w:pPr>
+        <w:pStyle w:val="ListBullet"/>
+        <w:spacing w:after="40"/>
+        <w:ind w:left="360"/>
+      </w:pPr>
+      <w:r>
+        <w:t>Mitigation: run through at least one down-trending period on paper before committing real capital</w:t>
+      </w:r>
+    </w:p>
+    <w:p>
+      <w:pPr>
+        <w:spacing w:before="160" w:after="40"/>
+      </w:pPr>
+      <w:r>
+        <w:rPr>
+          <w:b/>
+          <w:color w:val="F47B20"/>
+          <w:sz w:val="22"/>
+        </w:rPr>
+        <w:t>Risk 3: Capital Adequacy vs. Daily Output</w:t>
+      </w:r>
+    </w:p>
+    <w:p>
+      <w:pPr>
+        <w:spacing w:after="80"/>
+      </w:pPr>
+      <w:r>
+        <w:t>At $100K with $5K–$7K per position, 15 trades = $75K–$105K deployed. If the daily output goal grows (say to $1K/day), you either need more capital or higher win rate — you cannot simply add more positions without more capital.</w:t>
+      </w:r>
+    </w:p>
+    <w:p>
+      <w:pPr>
+        <w:pStyle w:val="ListBullet"/>
+        <w:spacing w:after="40"/>
+        <w:ind w:left="360"/>
+      </w:pPr>
+      <w:r>
+        <w:t>Path: at $716/day → capital compounds to ~$140K in 45 trading days → same % = $1K/day</w:t>
+      </w:r>
+    </w:p>
+    <w:p>
+      <w:pPr>
+        <w:pStyle w:val="ListBullet"/>
+        <w:spacing w:after="40"/>
+        <w:ind w:left="360"/>
+      </w:pPr>
+      <w:r>
+        <w:t>This is the natural scaling path without adding risk</w:t>
+      </w:r>
+    </w:p>
+    <w:p>
+      <w:pPr>
+        <w:spacing w:before="80" w:after="80"/>
+      </w:pPr>
+      <w:r>
+        <w:rPr>
+          <w:color w:val="CCCCCC"/>
+          <w:sz w:val="16"/>
+        </w:rPr>
+        <w:t>────────────────────────────────────────────────────────────────────────────────</w:t>
+      </w:r>
+    </w:p>
+    <w:p>
+      <w:pPr>
+        <w:spacing w:before="160" w:after="40"/>
+      </w:pPr>
+      <w:r>
+        <w:rPr>
+          <w:b/>
+          <w:color w:val="1A7A3A"/>
+          <w:sz w:val="22"/>
+        </w:rPr>
+        <w:t>Two Separate Applications Going Forward</w:t>
+      </w:r>
+    </w:p>
+    <w:p>
+      <w:pPr>
+        <w:spacing w:after="80"/>
+      </w:pPr>
+      <w:r>
+        <w:t>The cash flow goal and the product/alpha goal are now explicitly decoupled. They should be built as two separate things:</w:t>
+      </w:r>
+    </w:p>
+    <w:tbl>
+      <w:tblPr>
+        <w:tblStyle w:val="TableGrid"/>
+        <w:tblW w:type="auto" w:w="0"/>
+        <w:tblLook w:firstColumn="1" w:firstRow="1" w:lastColumn="0" w:lastRow="0" w:noHBand="0" w:noVBand="1" w:val="04A0"/>
+      </w:tblPr>
+      <w:tblGrid>
+        <w:gridCol w:w="1728"/>
+        <w:gridCol w:w="1728"/>
+        <w:gridCol w:w="1728"/>
+        <w:gridCol w:w="1728"/>
+        <w:gridCol w:w="1728"/>
+      </w:tblGrid>
+      <w:tr>
+        <w:tc>
+          <w:tcPr>
+            <w:tcW w:type="dxa" w:w="1728"/>
+          </w:tcPr>
+          <w:p>
+            <w:r>
+              <w:rPr>
+                <w:b/>
+                <w:color w:val="1A3A6A"/>
+              </w:rPr>
+              <w:t>Application</w:t>
+            </w:r>
+          </w:p>
+        </w:tc>
+        <w:tc>
+          <w:tcPr>
+            <w:tcW w:type="dxa" w:w="1728"/>
+          </w:tcPr>
+          <w:p>
+            <w:r>
+              <w:rPr>
+                <w:b/>
+                <w:color w:val="1A3A6A"/>
+              </w:rPr>
+              <w:t>Goal</w:t>
+            </w:r>
+          </w:p>
+        </w:tc>
+        <w:tc>
+          <w:tcPr>
+            <w:tcW w:type="dxa" w:w="1728"/>
+          </w:tcPr>
+          <w:p>
+            <w:r>
+              <w:rPr>
+                <w:b/>
+                <w:color w:val="1A3A6A"/>
+              </w:rPr>
+              <w:t>Signal</w:t>
+            </w:r>
+          </w:p>
+        </w:tc>
+        <w:tc>
+          <w:tcPr>
+            <w:tcW w:type="dxa" w:w="1728"/>
+          </w:tcPr>
+          <w:p>
+            <w:r>
+              <w:rPr>
+                <w:b/>
+                <w:color w:val="1A3A6A"/>
+              </w:rPr>
+              <w:t>Hold Period</w:t>
+            </w:r>
+          </w:p>
+        </w:tc>
+        <w:tc>
+          <w:tcPr>
+            <w:tcW w:type="dxa" w:w="1728"/>
+          </w:tcPr>
+          <w:p>
+            <w:r>
+              <w:rPr>
+                <w:b/>
+                <w:color w:val="1A3A6A"/>
+              </w:rPr>
+              <w:t>Success Metric</w:t>
+            </w:r>
+          </w:p>
+        </w:tc>
+      </w:tr>
+      <w:tr>
+        <w:tc>
+          <w:tcPr>
+            <w:tcW w:type="dxa" w:w="1728"/>
+          </w:tcPr>
+          <w:p/>
+        </w:tc>
+        <w:tc>
+          <w:tcPr>
+            <w:tcW w:type="dxa" w:w="1728"/>
+          </w:tcPr>
+          <w:p/>
+        </w:tc>
+        <w:tc>
+          <w:tcPr>
+            <w:tcW w:type="dxa" w:w="1728"/>
+          </w:tcPr>
+          <w:p/>
+        </w:tc>
+        <w:tc>
+          <w:tcPr>
+            <w:tcW w:type="dxa" w:w="1728"/>
+          </w:tcPr>
+          <w:p/>
+        </w:tc>
+        <w:tc>
+          <w:tcPr>
+            <w:tcW w:type="dxa" w:w="1728"/>
+          </w:tcPr>
+          <w:p/>
+        </w:tc>
+      </w:tr>
+      <w:tr>
+        <w:tc>
+          <w:tcPr>
+            <w:tcW w:type="dxa" w:w="1728"/>
+          </w:tcPr>
+          <w:p/>
+        </w:tc>
+        <w:tc>
+          <w:tcPr>
+            <w:tcW w:type="dxa" w:w="1728"/>
+          </w:tcPr>
+          <w:p/>
+        </w:tc>
+        <w:tc>
+          <w:tcPr>
+            <w:tcW w:type="dxa" w:w="1728"/>
+          </w:tcPr>
+          <w:p/>
+        </w:tc>
+        <w:tc>
+          <w:tcPr>
+            <w:tcW w:type="dxa" w:w="1728"/>
+          </w:tcPr>
+          <w:p/>
+        </w:tc>
+        <w:tc>
+          <w:tcPr>
+            <w:tcW w:type="dxa" w:w="1728"/>
+          </w:tcPr>
+          <w:p/>
+        </w:tc>
+      </w:tr>
+      <w:tr>
+        <w:tc>
+          <w:tcPr>
+            <w:tcW w:type="dxa" w:w="1728"/>
+          </w:tcPr>
+          <w:p>
+            <w:r>
+              <w:t>This system (App 1)</w:t>
+            </w:r>
+          </w:p>
+        </w:tc>
+        <w:tc>
+          <w:tcPr>
+            <w:tcW w:type="dxa" w:w="1728"/>
+          </w:tcPr>
+          <w:p>
+            <w:r>
+              <w:t>Personal cash flow — $500–700/day</w:t>
+            </w:r>
+          </w:p>
+        </w:tc>
+        <w:tc>
+          <w:tcPr>
+            <w:tcW w:type="dxa" w:w="1728"/>
+          </w:tcPr>
+          <w:p>
+            <w:r>
+              <w:t>Intraday momentum (Mode 1)</w:t>
+            </w:r>
+          </w:p>
+        </w:tc>
+        <w:tc>
+          <w:tcPr>
+            <w:tcW w:type="dxa" w:w="1728"/>
+          </w:tcPr>
+          <w:p>
+            <w:r>
+              <w:t>Same day — no overnight</w:t>
+            </w:r>
+          </w:p>
+        </w:tc>
+        <w:tc>
+          <w:tcPr>
+            <w:tcW w:type="dxa" w:w="1728"/>
+          </w:tcPr>
+          <w:p>
+            <w:r>
+              <w:t>Consistent positive EV days; win rate ≥50% live</w:t>
+            </w:r>
+          </w:p>
+        </w:tc>
+      </w:tr>
+      <w:tr>
+        <w:tc>
+          <w:tcPr>
+            <w:tcW w:type="dxa" w:w="1728"/>
+          </w:tcPr>
+          <w:p>
+            <w:r>
+              <w:t>Future SaaS product (App 2)</w:t>
+            </w:r>
+          </w:p>
+        </w:tc>
+        <w:tc>
+          <w:tcPr>
+            <w:tcW w:type="dxa" w:w="1728"/>
+          </w:tcPr>
+          <w:p>
+            <w:r>
+              <w:t>Productize for other traders</w:t>
+            </w:r>
+          </w:p>
+        </w:tc>
+        <w:tc>
+          <w:tcPr>
+            <w:tcW w:type="dxa" w:w="1728"/>
+          </w:tcPr>
+          <w:p>
+            <w:r>
+              <w:t>PEAD + insider buys + unusual options (Mode 2)</w:t>
+            </w:r>
+          </w:p>
+        </w:tc>
+        <w:tc>
+          <w:tcPr>
+            <w:tcW w:type="dxa" w:w="1728"/>
+          </w:tcPr>
+          <w:p>
+            <w:r>
+              <w:t>3–20 days</w:t>
+            </w:r>
+          </w:p>
+        </w:tc>
+        <w:tc>
+          <w:tcPr>
+            <w:tcW w:type="dxa" w:w="1728"/>
+          </w:tcPr>
+          <w:p>
+            <w:r>
+              <w:t>Sharpe ≥1.5 over 200+ live trades; auditable signal quality</w:t>
+            </w:r>
+          </w:p>
+        </w:tc>
+      </w:tr>
+    </w:tbl>
+    <w:p/>
+    <w:p>
+      <w:pPr>
+        <w:spacing w:after="80"/>
+      </w:pPr>
+      <w:r>
+        <w:t>App 1 is what we are building now and validating through June 2026. App 2 is a future separate application — different signal architecture, different hold period, different success metrics, different codebase. Do not conflate them. Do not add Mode 2 complexity to App 1 in service of App 2.</w:t>
+      </w:r>
+    </w:p>
+    <w:p>
+      <w:pPr>
+        <w:spacing w:before="80" w:after="80"/>
+      </w:pPr>
+      <w:r>
+        <w:rPr>
+          <w:color w:val="CCCCCC"/>
+          <w:sz w:val="16"/>
+        </w:rPr>
+        <w:t>────────────────────────────────────────────────────────────────────────────────</w:t>
+      </w:r>
+    </w:p>
+    <w:p>
+      <w:pPr>
+        <w:spacing w:before="160" w:after="40"/>
+      </w:pPr>
+      <w:r>
+        <w:rPr>
+          <w:b/>
+          <w:color w:val="F47B20"/>
+          <w:sz w:val="22"/>
+        </w:rPr>
+        <w:t>Revised Sprint Priorities for Cash Flow Goal</w:t>
+      </w:r>
+    </w:p>
+    <w:p>
+      <w:pPr>
+        <w:pStyle w:val="ListBullet"/>
+        <w:spacing w:after="40"/>
+        <w:ind w:left="360"/>
+      </w:pPr>
+      <w:r>
+        <w:t>1. Pass the June 1 gate — native trailing stop validated, win rate ≥80% on paper</w:t>
+      </w:r>
+    </w:p>
+    <w:p>
+      <w:pPr>
+        <w:pStyle w:val="ListBullet"/>
+        <w:spacing w:after="40"/>
+        <w:ind w:left="360"/>
+      </w:pPr>
+      <w:r>
+        <w:t>2. 15-min momentum confirmation (2f) — small improvement to Mode 1 signal quality</w:t>
+      </w:r>
+    </w:p>
+    <w:p>
+      <w:pPr>
+        <w:pStyle w:val="ListBullet"/>
+        <w:spacing w:after="40"/>
+        <w:ind w:left="360"/>
+      </w:pPr>
+      <w:r>
+        <w:t>3. Model paper-to-live degradation in eval — track expected vs. actual fill prices</w:t>
+      </w:r>
+    </w:p>
+    <w:p>
+      <w:pPr>
+        <w:pStyle w:val="ListBullet"/>
+        <w:spacing w:after="40"/>
+        <w:ind w:left="360"/>
+      </w:pPr>
+      <w:r>
+        <w:t>4. Deploy $10K–$25K real capital; validate live win rate matches paper within ±10%</w:t>
+      </w:r>
+    </w:p>
+    <w:p>
+      <w:pPr>
+        <w:pStyle w:val="ListBullet"/>
+        <w:spacing w:after="40"/>
+        <w:ind w:left="360"/>
+      </w:pPr>
+      <w:r>
+        <w:t>5. Scale capital once live win rate is confirmed over 60+ real trades</w:t>
+      </w:r>
+    </w:p>
+    <w:p>
+      <w:pPr>
+        <w:pStyle w:val="ListBullet"/>
+        <w:spacing w:after="40"/>
+        <w:ind w:left="360"/>
+      </w:pPr>
+      <w:r>
+        <w:t>6. App 2 planning begins only after App 1 is running profitably on real money</w:t>
       </w:r>
     </w:p>
     <w:sectPr>

</xml_diff>